<commit_message>
Actualiza documentación del proyecto
</commit_message>
<xml_diff>
--- a/documentacion.docx
+++ b/documentacion.docx
@@ -508,6 +508,157 @@
         <w:t>La primera version funcional del e-commerce esta implementada y desplegada. Las integraciones de correo e imagenes fueron configuradas y probadas en produccion. Antes de comercializar, se deben completar los pendientes de pagos reales, automatizacion de reservas, seguridad operativa, dominio comercial, aspectos legales y la bateria de pruebas.</w:t>
       </w:r>
     </w:p>
+    <w:p>
+      <w:pPr>
+        <w:pStyle w:val="Heading1"/>
+      </w:pPr>
+      <w:r>
+        <w:t>9. Mejoras posteriores</w:t>
+      </w:r>
+    </w:p>
+    <w:p>
+      <w:pPr>
+        <w:pStyle w:val="Heading2"/>
+      </w:pPr>
+      <w:r>
+        <w:t>Interfaz de la tienda</w:t>
+      </w:r>
+    </w:p>
+    <w:p>
+      <w:pPr>
+        <w:pStyle w:val="ListBullet"/>
+      </w:pPr>
+      <w:r>
+        <w:t>Se actualizo el titulo de la tienda a 'Tienda Online' y se modernizo el estilo visual con fondo, tarjetas, sombras y controles responsive.</w:t>
+      </w:r>
+    </w:p>
+    <w:p>
+      <w:pPr>
+        <w:pStyle w:val="ListBullet"/>
+      </w:pPr>
+      <w:r>
+        <w:t>Se agrego un acceso visible al carrito con icono y contador de productos.</w:t>
+      </w:r>
+    </w:p>
+    <w:p>
+      <w:pPr>
+        <w:pStyle w:val="ListBullet"/>
+      </w:pPr>
+      <w:r>
+        <w:t>El historial de pedidos del cliente fue rediseñado para destacar total, fecha, estados de pago y articulos.</w:t>
+      </w:r>
+    </w:p>
+    <w:p>
+      <w:pPr>
+        <w:pStyle w:val="ListBullet"/>
+      </w:pPr>
+      <w:r>
+        <w:t>Las imagenes del catalogo incorporan zoom al pasar el mouse y una vista ampliada al hacer clic.</w:t>
+      </w:r>
+    </w:p>
+    <w:p>
+      <w:pPr>
+        <w:pStyle w:val="Heading2"/>
+      </w:pPr>
+      <w:r>
+        <w:t>Documentacion de la API</w:t>
+      </w:r>
+    </w:p>
+    <w:p>
+      <w:r>
+        <w:t>Se incorporo documentacion OpenAPI generada con Django REST Framework y drf-spectacular:</w:t>
+      </w:r>
+    </w:p>
+    <w:p>
+      <w:pPr>
+        <w:pStyle w:val="ListBullet"/>
+      </w:pPr>
+      <w:r>
+        <w:t>Swagger UI: /api/docs/</w:t>
+      </w:r>
+    </w:p>
+    <w:p>
+      <w:pPr>
+        <w:pStyle w:val="ListBullet"/>
+      </w:pPr>
+      <w:r>
+        <w:t>ReDoc: /api/redoc/</w:t>
+      </w:r>
+    </w:p>
+    <w:p>
+      <w:pPr>
+        <w:pStyle w:val="ListBullet"/>
+      </w:pPr>
+      <w:r>
+        <w:t>Esquema OpenAPI: /api/schema/</w:t>
+      </w:r>
+    </w:p>
+    <w:p>
+      <w:r>
+        <w:t>La documentacion describe los endpoints de catalogo, autenticacion, carrito, pedidos, Mercado Pago y webhook.</w:t>
+      </w:r>
+    </w:p>
+    <w:p>
+      <w:pPr>
+        <w:pStyle w:val="Heading2"/>
+      </w:pPr>
+      <w:r>
+        <w:t>Recuperacion de contraseña</w:t>
+      </w:r>
+    </w:p>
+    <w:p>
+      <w:pPr>
+        <w:pStyle w:val="ListBullet"/>
+      </w:pPr>
+      <w:r>
+        <w:t>Se agrego la opcion 'Olvidaste tu contraseña?' en el formulario de inicio de sesion.</w:t>
+      </w:r>
+    </w:p>
+    <w:p>
+      <w:pPr>
+        <w:pStyle w:val="ListBullet"/>
+      </w:pPr>
+      <w:r>
+        <w:t>El usuario recibe por Brevo un enlace de un solo uso para crear una nueva contraseña.</w:t>
+      </w:r>
+    </w:p>
+    <w:p>
+      <w:pPr>
+        <w:pStyle w:val="ListBullet"/>
+      </w:pPr>
+      <w:r>
+        <w:t>El token se invalida luego de usarse y la API no revela si una direccion de email esta registrada.</w:t>
+      </w:r>
+    </w:p>
+    <w:p>
+      <w:pPr>
+        <w:pStyle w:val="ListBullet"/>
+      </w:pPr>
+      <w:r>
+        <w:t>Endpoints: POST /api/auth/password-reset/ y POST /api/auth/password-reset/confirm/.</w:t>
+      </w:r>
+    </w:p>
+    <w:p>
+      <w:pPr>
+        <w:pStyle w:val="ListBullet"/>
+      </w:pPr>
+      <w:r>
+        <w:t>El flujo fue probado correctamente en produccion.</w:t>
+      </w:r>
+    </w:p>
+    <w:p>
+      <w:pPr>
+        <w:pStyle w:val="Heading2"/>
+      </w:pPr>
+      <w:r>
+        <w:t>Pruebas automatizadas</w:t>
+      </w:r>
+    </w:p>
+    <w:p>
+      <w:r>
+        <w:t>La suite de backend fue ampliada a 60 pruebas correctas. Incluye aislamiento entre usuarios, permisos administrativos, validacion de webhooks, expiracion de reservas, documentacion OpenAPI y recuperacion de contraseña.</w:t>
+      </w:r>
+    </w:p>
     <w:sectPr>
       <w:pgSz w:w="12240" w:h="15840"/>
       <w:pgMar w:top="1008" w:right="1152" w:bottom="1008" w:left="1152" w:header="720" w:footer="720" w:gutter="0"/>

</xml_diff>